<commit_message>
still updating service to accomodate shifts
</commit_message>
<xml_diff>
--- a/Apps/CentralOperator/OperatorLogin/CentralOperatorShiftEditor/documentation/Integration Guide.docx
+++ b/Apps/CentralOperator/OperatorLogin/CentralOperatorShiftEditor/documentation/Integration Guide.docx
@@ -2,6 +2,487 @@
 <file path=word/document.xml><?xml version="1.0" encoding="utf-8"?>
 <w:document xmlns:wpc="http://schemas.microsoft.com/office/word/2010/wordprocessingCanvas" xmlns:cx="http://schemas.microsoft.com/office/drawing/2014/chartex" xmlns:cx1="http://schemas.microsoft.com/office/drawing/2015/9/8/chartex" xmlns:cx2="http://schemas.microsoft.com/office/drawing/2015/10/21/chartex" xmlns:cx3="http://schemas.microsoft.com/office/drawing/2016/5/9/chartex" xmlns:cx4="http://schemas.microsoft.com/office/drawing/2016/5/10/chartex" xmlns:cx5="http://schemas.microsoft.com/office/drawing/2016/5/11/chartex" xmlns:cx6="http://schemas.microsoft.com/office/drawing/2016/5/12/chartex" xmlns:cx7="http://schemas.microsoft.com/office/drawing/2016/5/13/chartex" xmlns:cx8="http://schemas.microsoft.com/office/drawing/2016/5/14/chartex" xmlns:mc="http://schemas.openxmlformats.org/markup-compatibility/2006" xmlns:aink="http://schemas.microsoft.com/office/drawing/2016/ink" xmlns:am3d="http://schemas.microsoft.com/office/drawing/2017/model3d" xmlns:o="urn:schemas-microsoft-com:office:office" xmlns:oel="http://schemas.microsoft.com/office/2019/extlst" xmlns:r="http://schemas.openxmlformats.org/officeDocument/2006/relationships" xmlns:m="http://schemas.openxmlformats.org/officeDocument/2006/math" xmlns:v="urn:schemas-microsoft-com:vml" xmlns:wp14="http://schemas.microsoft.com/office/word/2010/wordprocessingDrawing" xmlns:wp="http://schemas.openxmlformats.org/drawingml/2006/wordprocessingDrawing" xmlns:w10="urn:schemas-microsoft-com:office:word" xmlns:w="http://schemas.openxmlformats.org/wordprocessingml/2006/main" xmlns:w14="http://schemas.microsoft.com/office/word/2010/wordml" xmlns:w15="http://schemas.microsoft.com/office/word/2012/wordml" xmlns:w16cex="http://schemas.microsoft.com/office/word/2018/wordml/cex" xmlns:w16cid="http://schemas.microsoft.com/office/word/2016/wordml/cid" xmlns:w16="http://schemas.microsoft.com/office/word/2018/wordml" xmlns:w16du="http://schemas.microsoft.com/office/word/2023/wordml/word16du" xmlns:w16sdtdh="http://schemas.microsoft.com/office/word/2020/wordml/sdtdatahash" xmlns:w16sdtfl="http://schemas.microsoft.com/office/word/2024/wordml/sdtformatlock" xmlns:w16se="http://schemas.microsoft.com/office/word/2015/wordml/symex" xmlns:wpg="http://schemas.microsoft.com/office/word/2010/wordprocessingGroup" xmlns:wpi="http://schemas.microsoft.com/office/word/2010/wordprocessingInk" xmlns:wne="http://schemas.microsoft.com/office/word/2006/wordml" xmlns:wps="http://schemas.microsoft.com/office/word/2010/wordprocessingShape" mc:Ignorable="w14 w15 w16se w16cid w16 w16cex w16sdtdh w16sdtfl w16du wp14">
   <w:body>
+    <w:p>
+      <w:pPr>
+        <w:pStyle w:val="Heading1"/>
+      </w:pPr>
+      <w:r>
+        <w:t>Current (Pre Shifts) Logic:</w:t>
+      </w:r>
+    </w:p>
+    <w:p/>
+    <w:p>
+      <w:pPr>
+        <w:pStyle w:val="ListParagraph"/>
+        <w:numPr>
+          <w:ilvl w:val="0"/>
+          <w:numId w:val="16"/>
+        </w:numPr>
+      </w:pPr>
+      <w:r>
+        <w:t>Card Read: System reads RFID card and extracts card ID</w:t>
+      </w:r>
+    </w:p>
+    <w:p>
+      <w:pPr>
+        <w:pStyle w:val="ListParagraph"/>
+        <w:numPr>
+          <w:ilvl w:val="0"/>
+          <w:numId w:val="16"/>
+        </w:numPr>
+      </w:pPr>
+      <w:r>
+        <w:t xml:space="preserve">Tag Validation: Looks up card in </w:t>
+      </w:r>
+      <w:proofErr w:type="spellStart"/>
+      <w:r>
+        <w:t>TagsRfid</w:t>
+      </w:r>
+      <w:proofErr w:type="spellEnd"/>
+      <w:r>
+        <w:t xml:space="preserve"> to get operator reference</w:t>
+      </w:r>
+    </w:p>
+    <w:p>
+      <w:pPr>
+        <w:pStyle w:val="ListParagraph"/>
+        <w:numPr>
+          <w:ilvl w:val="0"/>
+          <w:numId w:val="16"/>
+        </w:numPr>
+      </w:pPr>
+      <w:r>
+        <w:t>Operator Validation: Checks if operator is retired (retired operators cannot log in/out)</w:t>
+      </w:r>
+    </w:p>
+    <w:p>
+      <w:pPr>
+        <w:pStyle w:val="ListParagraph"/>
+        <w:numPr>
+          <w:ilvl w:val="0"/>
+          <w:numId w:val="16"/>
+        </w:numPr>
+      </w:pPr>
+      <w:r>
+        <w:t xml:space="preserve">Permission Check: If </w:t>
+      </w:r>
+      <w:proofErr w:type="spellStart"/>
+      <w:r>
+        <w:t>UseOperatorPermissions</w:t>
+      </w:r>
+      <w:proofErr w:type="spellEnd"/>
+      <w:r>
+        <w:t xml:space="preserve"> is enabled, checks </w:t>
+      </w:r>
+      <w:proofErr w:type="spellStart"/>
+      <w:r>
+        <w:t>IsAllowedToManuallyLogout</w:t>
+      </w:r>
+      <w:proofErr w:type="spellEnd"/>
+    </w:p>
+    <w:p>
+      <w:pPr>
+        <w:pStyle w:val="ListParagraph"/>
+        <w:numPr>
+          <w:ilvl w:val="0"/>
+          <w:numId w:val="16"/>
+        </w:numPr>
+      </w:pPr>
+      <w:r>
+        <w:t>Break Handling: If operator is on break, ends the break automatically</w:t>
+      </w:r>
+    </w:p>
+    <w:p>
+      <w:pPr>
+        <w:pStyle w:val="ListParagraph"/>
+        <w:numPr>
+          <w:ilvl w:val="0"/>
+          <w:numId w:val="16"/>
+        </w:numPr>
+      </w:pPr>
+      <w:r>
+        <w:t>Already Logged In Check: Determines if operator is currently logged in anywhere</w:t>
+      </w:r>
+    </w:p>
+    <w:p>
+      <w:pPr>
+        <w:pStyle w:val="ListParagraph"/>
+        <w:numPr>
+          <w:ilvl w:val="0"/>
+          <w:numId w:val="16"/>
+        </w:numPr>
+      </w:pPr>
+      <w:r>
+        <w:t>Same Location Logout: If operator is logged in at the same machine/sub location where they swiped:</w:t>
+      </w:r>
+    </w:p>
+    <w:p>
+      <w:pPr>
+        <w:pStyle w:val="ListParagraph"/>
+        <w:numPr>
+          <w:ilvl w:val="1"/>
+          <w:numId w:val="16"/>
+        </w:numPr>
+      </w:pPr>
+      <w:r>
+        <w:t>If they have manual logout permission (or permissions disabled), log them out</w:t>
+      </w:r>
+    </w:p>
+    <w:p>
+      <w:pPr>
+        <w:pStyle w:val="ListParagraph"/>
+        <w:numPr>
+          <w:ilvl w:val="1"/>
+          <w:numId w:val="16"/>
+        </w:numPr>
+      </w:pPr>
+      <w:r>
+        <w:t>If they lack permission, flash orange LED and deny logout</w:t>
+      </w:r>
+    </w:p>
+    <w:p>
+      <w:pPr>
+        <w:pStyle w:val="ListParagraph"/>
+        <w:numPr>
+          <w:ilvl w:val="0"/>
+          <w:numId w:val="16"/>
+        </w:numPr>
+      </w:pPr>
+      <w:r>
+        <w:t>Different Location Logout: If operator is logged in elsewhere, log them out of that location first</w:t>
+      </w:r>
+    </w:p>
+    <w:p>
+      <w:pPr>
+        <w:pStyle w:val="ListParagraph"/>
+        <w:numPr>
+          <w:ilvl w:val="0"/>
+          <w:numId w:val="16"/>
+        </w:numPr>
+      </w:pPr>
+      <w:r>
+        <w:t>Multi-Login Check: If location only allows one login (</w:t>
+      </w:r>
+      <w:proofErr w:type="spellStart"/>
+      <w:r>
+        <w:t>MaxLogins</w:t>
+      </w:r>
+      <w:proofErr w:type="spellEnd"/>
+      <w:r>
+        <w:t xml:space="preserve"> == 1), log out any other operator at that location</w:t>
+      </w:r>
+    </w:p>
+    <w:p>
+      <w:pPr>
+        <w:pStyle w:val="ListParagraph"/>
+        <w:numPr>
+          <w:ilvl w:val="0"/>
+          <w:numId w:val="16"/>
+        </w:numPr>
+      </w:pPr>
+      <w:r>
+        <w:t>Login: If operator isn't logged in (or was just logged out), and location has capacity, log them in</w:t>
+      </w:r>
+    </w:p>
+    <w:p>
+      <w:pPr>
+        <w:pStyle w:val="Heading1"/>
+      </w:pPr>
+      <w:r>
+        <w:t>Integration Recommendations</w:t>
+      </w:r>
+    </w:p>
+    <w:p/>
+    <w:p>
+      <w:r>
+        <w:rPr>
+          <w:b/>
+          <w:bCs/>
+        </w:rPr>
+        <w:t>Step 1-3 (Card Read, Tag Validation, Operator Validation)</w:t>
+      </w:r>
+      <w:r>
+        <w:t>:</w:t>
+      </w:r>
+    </w:p>
+    <w:p>
+      <w:pPr>
+        <w:pStyle w:val="ListParagraph"/>
+        <w:numPr>
+          <w:ilvl w:val="0"/>
+          <w:numId w:val="22"/>
+        </w:numPr>
+      </w:pPr>
+      <w:r>
+        <w:t>No changes needed - these remain the same</w:t>
+      </w:r>
+    </w:p>
+    <w:p>
+      <w:r>
+        <w:rPr>
+          <w:b/>
+          <w:bCs/>
+        </w:rPr>
+        <w:t>Step 4 (Permission Check)</w:t>
+      </w:r>
+      <w:r>
+        <w:t>:</w:t>
+      </w:r>
+    </w:p>
+    <w:p>
+      <w:pPr>
+        <w:numPr>
+          <w:ilvl w:val="0"/>
+          <w:numId w:val="18"/>
+        </w:numPr>
+      </w:pPr>
+      <w:r>
+        <w:t>Add shift validation here: Check if the machine/sub has an active shift for current time</w:t>
+      </w:r>
+    </w:p>
+    <w:p>
+      <w:pPr>
+        <w:numPr>
+          <w:ilvl w:val="0"/>
+          <w:numId w:val="18"/>
+        </w:numPr>
+      </w:pPr>
+      <w:r>
+        <w:t xml:space="preserve">If </w:t>
+      </w:r>
+      <w:proofErr w:type="spellStart"/>
+      <w:r>
+        <w:t>UseShiftManagement</w:t>
+      </w:r>
+      <w:proofErr w:type="spellEnd"/>
+      <w:r>
+        <w:t xml:space="preserve"> == true and machine has active shift, retrieve shift details including Delta+/Delta-</w:t>
+      </w:r>
+    </w:p>
+    <w:p>
+      <w:r>
+        <w:rPr>
+          <w:b/>
+          <w:bCs/>
+        </w:rPr>
+        <w:t>Step 5 (Break Handling)</w:t>
+      </w:r>
+      <w:r>
+        <w:t>:</w:t>
+      </w:r>
+    </w:p>
+    <w:p>
+      <w:pPr>
+        <w:numPr>
+          <w:ilvl w:val="0"/>
+          <w:numId w:val="19"/>
+        </w:numPr>
+      </w:pPr>
+      <w:r>
+        <w:t>No changes needed</w:t>
+      </w:r>
+    </w:p>
+    <w:p>
+      <w:r>
+        <w:rPr>
+          <w:b/>
+          <w:bCs/>
+        </w:rPr>
+        <w:t>Step 6 (Already Logged In Check)</w:t>
+      </w:r>
+      <w:r>
+        <w:t>:</w:t>
+      </w:r>
+    </w:p>
+    <w:p>
+      <w:pPr>
+        <w:numPr>
+          <w:ilvl w:val="0"/>
+          <w:numId w:val="20"/>
+        </w:numPr>
+      </w:pPr>
+      <w:r>
+        <w:t>Add shift context: When checking if operator is logged in, also store when they logged in and what shift (if any) was active at that time</w:t>
+      </w:r>
+    </w:p>
+    <w:p>
+      <w:r>
+        <w:rPr>
+          <w:b/>
+          <w:bCs/>
+        </w:rPr>
+        <w:t>Step 7 (Same Location Logout)</w:t>
+      </w:r>
+      <w:r>
+        <w:t>:</w:t>
+      </w:r>
+    </w:p>
+    <w:p>
+      <w:pPr>
+        <w:numPr>
+          <w:ilvl w:val="0"/>
+          <w:numId w:val="21"/>
+        </w:numPr>
+      </w:pPr>
+      <w:r>
+        <w:rPr>
+          <w:b/>
+          <w:bCs/>
+        </w:rPr>
+        <w:t>Major Change Required</w:t>
+      </w:r>
+      <w:r>
+        <w:t>: Add shift-based logout rules:</w:t>
+      </w:r>
+    </w:p>
+    <w:p>
+      <w:r>
+        <w:rPr>
+          <w:b/>
+          <w:bCs/>
+        </w:rPr>
+        <w:t>Step 8 (Different Location Logout)</w:t>
+      </w:r>
+      <w:r>
+        <w:t>:</w:t>
+      </w:r>
+    </w:p>
+    <w:p>
+      <w:pPr>
+        <w:numPr>
+          <w:ilvl w:val="0"/>
+          <w:numId w:val="23"/>
+        </w:numPr>
+      </w:pPr>
+      <w:r>
+        <w:t>Similar logic as Step 7, but also check if the OTHER location has shift management</w:t>
+      </w:r>
+    </w:p>
+    <w:p>
+      <w:pPr>
+        <w:numPr>
+          <w:ilvl w:val="0"/>
+          <w:numId w:val="23"/>
+        </w:numPr>
+      </w:pPr>
+      <w:r>
+        <w:lastRenderedPageBreak/>
+        <w:t xml:space="preserve">If other location has active shift and operator is outside delta, they cannot logout remotely unless they have </w:t>
+      </w:r>
+      <w:proofErr w:type="spellStart"/>
+      <w:r>
+        <w:t>CanReplaceOperator</w:t>
+      </w:r>
+      <w:proofErr w:type="spellEnd"/>
+    </w:p>
+    <w:p>
+      <w:r>
+        <w:rPr>
+          <w:b/>
+          <w:bCs/>
+        </w:rPr>
+        <w:t>Step 9 (Multi-Login Check)</w:t>
+      </w:r>
+      <w:r>
+        <w:t>:</w:t>
+      </w:r>
+    </w:p>
+    <w:p>
+      <w:pPr>
+        <w:numPr>
+          <w:ilvl w:val="0"/>
+          <w:numId w:val="24"/>
+        </w:numPr>
+      </w:pPr>
+      <w:r>
+        <w:rPr>
+          <w:b/>
+          <w:bCs/>
+        </w:rPr>
+        <w:t>Major Change Required</w:t>
+      </w:r>
+      <w:r>
+        <w:t>: Before logging out another operator:</w:t>
+      </w:r>
+    </w:p>
+    <w:p>
+      <w:r>
+        <w:rPr>
+          <w:b/>
+          <w:bCs/>
+        </w:rPr>
+        <w:t>Step 10 (Login)</w:t>
+      </w:r>
+      <w:r>
+        <w:t>:</w:t>
+      </w:r>
+    </w:p>
+    <w:p>
+      <w:pPr>
+        <w:numPr>
+          <w:ilvl w:val="0"/>
+          <w:numId w:val="25"/>
+        </w:numPr>
+      </w:pPr>
+      <w:r>
+        <w:t>Before logging in, verify the operator isn't violating shift rules at another location</w:t>
+      </w:r>
+    </w:p>
+    <w:p>
+      <w:pPr>
+        <w:numPr>
+          <w:ilvl w:val="0"/>
+          <w:numId w:val="25"/>
+        </w:numPr>
+      </w:pPr>
+      <w:r>
+        <w:t>Store the active shift ID with the login state for future reference</w:t>
+      </w:r>
+    </w:p>
+    <w:p>
+      <w:pPr>
+        <w:pStyle w:val="Heading1"/>
+      </w:pPr>
+      <w:r>
+        <w:t>Additional Logic</w:t>
+      </w:r>
+    </w:p>
+    <w:p>
+      <w:pPr>
+        <w:rPr>
+          <w:b/>
+          <w:bCs/>
+        </w:rPr>
+      </w:pPr>
+      <w:r>
+        <w:rPr>
+          <w:b/>
+          <w:bCs/>
+        </w:rPr>
+        <w:t>New Auto-Logout Logic</w:t>
+      </w:r>
+    </w:p>
+    <w:p>
+      <w:r>
+        <w:t xml:space="preserve">Add to the </w:t>
+      </w:r>
+      <w:proofErr w:type="spellStart"/>
+      <w:r>
+        <w:t>DoTiming</w:t>
+      </w:r>
+      <w:proofErr w:type="spellEnd"/>
+      <w:r>
+        <w:t xml:space="preserve">() method in </w:t>
+      </w:r>
+      <w:proofErr w:type="spellStart"/>
+      <w:r>
+        <w:t>TagReaderServiceFramework</w:t>
+      </w:r>
+      <w:proofErr w:type="spellEnd"/>
+      <w:r>
+        <w:t>:</w:t>
+      </w:r>
+    </w:p>
     <w:p/>
     <w:sectPr>
       <w:pgSz w:w="11906" w:h="16838"/>
@@ -129,6 +610,155 @@
     </w:lvl>
   </w:abstractNum>
   <w:abstractNum w:abstractNumId="1" w15:restartNumberingAfterBreak="0">
+    <w:nsid w:val="06B57E82"/>
+    <w:multiLevelType w:val="multilevel"/>
+    <w:tmpl w:val="43683E72"/>
+    <w:lvl w:ilvl="0">
+      <w:start w:val="1"/>
+      <w:numFmt w:val="bullet"/>
+      <w:lvlText w:val=""/>
+      <w:lvlJc w:val="left"/>
+      <w:pPr>
+        <w:tabs>
+          <w:tab w:val="num" w:pos="720"/>
+        </w:tabs>
+        <w:ind w:left="720" w:hanging="360"/>
+      </w:pPr>
+      <w:rPr>
+        <w:rFonts w:ascii="Symbol" w:hAnsi="Symbol" w:hint="default"/>
+        <w:sz w:val="20"/>
+      </w:rPr>
+    </w:lvl>
+    <w:lvl w:ilvl="1" w:tentative="1">
+      <w:start w:val="1"/>
+      <w:numFmt w:val="bullet"/>
+      <w:lvlText w:val="o"/>
+      <w:lvlJc w:val="left"/>
+      <w:pPr>
+        <w:tabs>
+          <w:tab w:val="num" w:pos="1440"/>
+        </w:tabs>
+        <w:ind w:left="1440" w:hanging="360"/>
+      </w:pPr>
+      <w:rPr>
+        <w:rFonts w:ascii="Courier New" w:hAnsi="Courier New" w:hint="default"/>
+        <w:sz w:val="20"/>
+      </w:rPr>
+    </w:lvl>
+    <w:lvl w:ilvl="2" w:tentative="1">
+      <w:start w:val="1"/>
+      <w:numFmt w:val="bullet"/>
+      <w:lvlText w:val=""/>
+      <w:lvlJc w:val="left"/>
+      <w:pPr>
+        <w:tabs>
+          <w:tab w:val="num" w:pos="2160"/>
+        </w:tabs>
+        <w:ind w:left="2160" w:hanging="360"/>
+      </w:pPr>
+      <w:rPr>
+        <w:rFonts w:ascii="Wingdings" w:hAnsi="Wingdings" w:hint="default"/>
+        <w:sz w:val="20"/>
+      </w:rPr>
+    </w:lvl>
+    <w:lvl w:ilvl="3" w:tentative="1">
+      <w:start w:val="1"/>
+      <w:numFmt w:val="bullet"/>
+      <w:lvlText w:val=""/>
+      <w:lvlJc w:val="left"/>
+      <w:pPr>
+        <w:tabs>
+          <w:tab w:val="num" w:pos="2880"/>
+        </w:tabs>
+        <w:ind w:left="2880" w:hanging="360"/>
+      </w:pPr>
+      <w:rPr>
+        <w:rFonts w:ascii="Wingdings" w:hAnsi="Wingdings" w:hint="default"/>
+        <w:sz w:val="20"/>
+      </w:rPr>
+    </w:lvl>
+    <w:lvl w:ilvl="4" w:tentative="1">
+      <w:start w:val="1"/>
+      <w:numFmt w:val="bullet"/>
+      <w:lvlText w:val=""/>
+      <w:lvlJc w:val="left"/>
+      <w:pPr>
+        <w:tabs>
+          <w:tab w:val="num" w:pos="3600"/>
+        </w:tabs>
+        <w:ind w:left="3600" w:hanging="360"/>
+      </w:pPr>
+      <w:rPr>
+        <w:rFonts w:ascii="Wingdings" w:hAnsi="Wingdings" w:hint="default"/>
+        <w:sz w:val="20"/>
+      </w:rPr>
+    </w:lvl>
+    <w:lvl w:ilvl="5" w:tentative="1">
+      <w:start w:val="1"/>
+      <w:numFmt w:val="bullet"/>
+      <w:lvlText w:val=""/>
+      <w:lvlJc w:val="left"/>
+      <w:pPr>
+        <w:tabs>
+          <w:tab w:val="num" w:pos="4320"/>
+        </w:tabs>
+        <w:ind w:left="4320" w:hanging="360"/>
+      </w:pPr>
+      <w:rPr>
+        <w:rFonts w:ascii="Wingdings" w:hAnsi="Wingdings" w:hint="default"/>
+        <w:sz w:val="20"/>
+      </w:rPr>
+    </w:lvl>
+    <w:lvl w:ilvl="6" w:tentative="1">
+      <w:start w:val="1"/>
+      <w:numFmt w:val="bullet"/>
+      <w:lvlText w:val=""/>
+      <w:lvlJc w:val="left"/>
+      <w:pPr>
+        <w:tabs>
+          <w:tab w:val="num" w:pos="5040"/>
+        </w:tabs>
+        <w:ind w:left="5040" w:hanging="360"/>
+      </w:pPr>
+      <w:rPr>
+        <w:rFonts w:ascii="Wingdings" w:hAnsi="Wingdings" w:hint="default"/>
+        <w:sz w:val="20"/>
+      </w:rPr>
+    </w:lvl>
+    <w:lvl w:ilvl="7" w:tentative="1">
+      <w:start w:val="1"/>
+      <w:numFmt w:val="bullet"/>
+      <w:lvlText w:val=""/>
+      <w:lvlJc w:val="left"/>
+      <w:pPr>
+        <w:tabs>
+          <w:tab w:val="num" w:pos="5760"/>
+        </w:tabs>
+        <w:ind w:left="5760" w:hanging="360"/>
+      </w:pPr>
+      <w:rPr>
+        <w:rFonts w:ascii="Wingdings" w:hAnsi="Wingdings" w:hint="default"/>
+        <w:sz w:val="20"/>
+      </w:rPr>
+    </w:lvl>
+    <w:lvl w:ilvl="8" w:tentative="1">
+      <w:start w:val="1"/>
+      <w:numFmt w:val="bullet"/>
+      <w:lvlText w:val=""/>
+      <w:lvlJc w:val="left"/>
+      <w:pPr>
+        <w:tabs>
+          <w:tab w:val="num" w:pos="6480"/>
+        </w:tabs>
+        <w:ind w:left="6480" w:hanging="360"/>
+      </w:pPr>
+      <w:rPr>
+        <w:rFonts w:ascii="Wingdings" w:hAnsi="Wingdings" w:hint="default"/>
+        <w:sz w:val="20"/>
+      </w:rPr>
+    </w:lvl>
+  </w:abstractNum>
+  <w:abstractNum w:abstractNumId="2" w15:restartNumberingAfterBreak="0">
     <w:nsid w:val="0CA84ACC"/>
     <w:multiLevelType w:val="multilevel"/>
     <w:tmpl w:val="88FA4E60"/>
@@ -277,7 +907,305 @@
       </w:rPr>
     </w:lvl>
   </w:abstractNum>
-  <w:abstractNum w:abstractNumId="2" w15:restartNumberingAfterBreak="0">
+  <w:abstractNum w:abstractNumId="3" w15:restartNumberingAfterBreak="0">
+    <w:nsid w:val="1C094207"/>
+    <w:multiLevelType w:val="multilevel"/>
+    <w:tmpl w:val="8BBE8D68"/>
+    <w:lvl w:ilvl="0">
+      <w:start w:val="1"/>
+      <w:numFmt w:val="bullet"/>
+      <w:lvlText w:val=""/>
+      <w:lvlJc w:val="left"/>
+      <w:pPr>
+        <w:tabs>
+          <w:tab w:val="num" w:pos="720"/>
+        </w:tabs>
+        <w:ind w:left="720" w:hanging="360"/>
+      </w:pPr>
+      <w:rPr>
+        <w:rFonts w:ascii="Symbol" w:hAnsi="Symbol" w:hint="default"/>
+        <w:sz w:val="20"/>
+      </w:rPr>
+    </w:lvl>
+    <w:lvl w:ilvl="1" w:tentative="1">
+      <w:start w:val="1"/>
+      <w:numFmt w:val="bullet"/>
+      <w:lvlText w:val="o"/>
+      <w:lvlJc w:val="left"/>
+      <w:pPr>
+        <w:tabs>
+          <w:tab w:val="num" w:pos="1440"/>
+        </w:tabs>
+        <w:ind w:left="1440" w:hanging="360"/>
+      </w:pPr>
+      <w:rPr>
+        <w:rFonts w:ascii="Courier New" w:hAnsi="Courier New" w:hint="default"/>
+        <w:sz w:val="20"/>
+      </w:rPr>
+    </w:lvl>
+    <w:lvl w:ilvl="2" w:tentative="1">
+      <w:start w:val="1"/>
+      <w:numFmt w:val="bullet"/>
+      <w:lvlText w:val=""/>
+      <w:lvlJc w:val="left"/>
+      <w:pPr>
+        <w:tabs>
+          <w:tab w:val="num" w:pos="2160"/>
+        </w:tabs>
+        <w:ind w:left="2160" w:hanging="360"/>
+      </w:pPr>
+      <w:rPr>
+        <w:rFonts w:ascii="Wingdings" w:hAnsi="Wingdings" w:hint="default"/>
+        <w:sz w:val="20"/>
+      </w:rPr>
+    </w:lvl>
+    <w:lvl w:ilvl="3" w:tentative="1">
+      <w:start w:val="1"/>
+      <w:numFmt w:val="bullet"/>
+      <w:lvlText w:val=""/>
+      <w:lvlJc w:val="left"/>
+      <w:pPr>
+        <w:tabs>
+          <w:tab w:val="num" w:pos="2880"/>
+        </w:tabs>
+        <w:ind w:left="2880" w:hanging="360"/>
+      </w:pPr>
+      <w:rPr>
+        <w:rFonts w:ascii="Wingdings" w:hAnsi="Wingdings" w:hint="default"/>
+        <w:sz w:val="20"/>
+      </w:rPr>
+    </w:lvl>
+    <w:lvl w:ilvl="4" w:tentative="1">
+      <w:start w:val="1"/>
+      <w:numFmt w:val="bullet"/>
+      <w:lvlText w:val=""/>
+      <w:lvlJc w:val="left"/>
+      <w:pPr>
+        <w:tabs>
+          <w:tab w:val="num" w:pos="3600"/>
+        </w:tabs>
+        <w:ind w:left="3600" w:hanging="360"/>
+      </w:pPr>
+      <w:rPr>
+        <w:rFonts w:ascii="Wingdings" w:hAnsi="Wingdings" w:hint="default"/>
+        <w:sz w:val="20"/>
+      </w:rPr>
+    </w:lvl>
+    <w:lvl w:ilvl="5" w:tentative="1">
+      <w:start w:val="1"/>
+      <w:numFmt w:val="bullet"/>
+      <w:lvlText w:val=""/>
+      <w:lvlJc w:val="left"/>
+      <w:pPr>
+        <w:tabs>
+          <w:tab w:val="num" w:pos="4320"/>
+        </w:tabs>
+        <w:ind w:left="4320" w:hanging="360"/>
+      </w:pPr>
+      <w:rPr>
+        <w:rFonts w:ascii="Wingdings" w:hAnsi="Wingdings" w:hint="default"/>
+        <w:sz w:val="20"/>
+      </w:rPr>
+    </w:lvl>
+    <w:lvl w:ilvl="6" w:tentative="1">
+      <w:start w:val="1"/>
+      <w:numFmt w:val="bullet"/>
+      <w:lvlText w:val=""/>
+      <w:lvlJc w:val="left"/>
+      <w:pPr>
+        <w:tabs>
+          <w:tab w:val="num" w:pos="5040"/>
+        </w:tabs>
+        <w:ind w:left="5040" w:hanging="360"/>
+      </w:pPr>
+      <w:rPr>
+        <w:rFonts w:ascii="Wingdings" w:hAnsi="Wingdings" w:hint="default"/>
+        <w:sz w:val="20"/>
+      </w:rPr>
+    </w:lvl>
+    <w:lvl w:ilvl="7" w:tentative="1">
+      <w:start w:val="1"/>
+      <w:numFmt w:val="bullet"/>
+      <w:lvlText w:val=""/>
+      <w:lvlJc w:val="left"/>
+      <w:pPr>
+        <w:tabs>
+          <w:tab w:val="num" w:pos="5760"/>
+        </w:tabs>
+        <w:ind w:left="5760" w:hanging="360"/>
+      </w:pPr>
+      <w:rPr>
+        <w:rFonts w:ascii="Wingdings" w:hAnsi="Wingdings" w:hint="default"/>
+        <w:sz w:val="20"/>
+      </w:rPr>
+    </w:lvl>
+    <w:lvl w:ilvl="8" w:tentative="1">
+      <w:start w:val="1"/>
+      <w:numFmt w:val="bullet"/>
+      <w:lvlText w:val=""/>
+      <w:lvlJc w:val="left"/>
+      <w:pPr>
+        <w:tabs>
+          <w:tab w:val="num" w:pos="6480"/>
+        </w:tabs>
+        <w:ind w:left="6480" w:hanging="360"/>
+      </w:pPr>
+      <w:rPr>
+        <w:rFonts w:ascii="Wingdings" w:hAnsi="Wingdings" w:hint="default"/>
+        <w:sz w:val="20"/>
+      </w:rPr>
+    </w:lvl>
+  </w:abstractNum>
+  <w:abstractNum w:abstractNumId="4" w15:restartNumberingAfterBreak="0">
+    <w:nsid w:val="22584008"/>
+    <w:multiLevelType w:val="multilevel"/>
+    <w:tmpl w:val="58868EDC"/>
+    <w:lvl w:ilvl="0">
+      <w:start w:val="1"/>
+      <w:numFmt w:val="bullet"/>
+      <w:lvlText w:val=""/>
+      <w:lvlJc w:val="left"/>
+      <w:pPr>
+        <w:tabs>
+          <w:tab w:val="num" w:pos="720"/>
+        </w:tabs>
+        <w:ind w:left="720" w:hanging="360"/>
+      </w:pPr>
+      <w:rPr>
+        <w:rFonts w:ascii="Symbol" w:hAnsi="Symbol" w:hint="default"/>
+        <w:sz w:val="20"/>
+      </w:rPr>
+    </w:lvl>
+    <w:lvl w:ilvl="1" w:tentative="1">
+      <w:start w:val="1"/>
+      <w:numFmt w:val="bullet"/>
+      <w:lvlText w:val="o"/>
+      <w:lvlJc w:val="left"/>
+      <w:pPr>
+        <w:tabs>
+          <w:tab w:val="num" w:pos="1440"/>
+        </w:tabs>
+        <w:ind w:left="1440" w:hanging="360"/>
+      </w:pPr>
+      <w:rPr>
+        <w:rFonts w:ascii="Courier New" w:hAnsi="Courier New" w:hint="default"/>
+        <w:sz w:val="20"/>
+      </w:rPr>
+    </w:lvl>
+    <w:lvl w:ilvl="2" w:tentative="1">
+      <w:start w:val="1"/>
+      <w:numFmt w:val="bullet"/>
+      <w:lvlText w:val=""/>
+      <w:lvlJc w:val="left"/>
+      <w:pPr>
+        <w:tabs>
+          <w:tab w:val="num" w:pos="2160"/>
+        </w:tabs>
+        <w:ind w:left="2160" w:hanging="360"/>
+      </w:pPr>
+      <w:rPr>
+        <w:rFonts w:ascii="Wingdings" w:hAnsi="Wingdings" w:hint="default"/>
+        <w:sz w:val="20"/>
+      </w:rPr>
+    </w:lvl>
+    <w:lvl w:ilvl="3" w:tentative="1">
+      <w:start w:val="1"/>
+      <w:numFmt w:val="bullet"/>
+      <w:lvlText w:val=""/>
+      <w:lvlJc w:val="left"/>
+      <w:pPr>
+        <w:tabs>
+          <w:tab w:val="num" w:pos="2880"/>
+        </w:tabs>
+        <w:ind w:left="2880" w:hanging="360"/>
+      </w:pPr>
+      <w:rPr>
+        <w:rFonts w:ascii="Wingdings" w:hAnsi="Wingdings" w:hint="default"/>
+        <w:sz w:val="20"/>
+      </w:rPr>
+    </w:lvl>
+    <w:lvl w:ilvl="4" w:tentative="1">
+      <w:start w:val="1"/>
+      <w:numFmt w:val="bullet"/>
+      <w:lvlText w:val=""/>
+      <w:lvlJc w:val="left"/>
+      <w:pPr>
+        <w:tabs>
+          <w:tab w:val="num" w:pos="3600"/>
+        </w:tabs>
+        <w:ind w:left="3600" w:hanging="360"/>
+      </w:pPr>
+      <w:rPr>
+        <w:rFonts w:ascii="Wingdings" w:hAnsi="Wingdings" w:hint="default"/>
+        <w:sz w:val="20"/>
+      </w:rPr>
+    </w:lvl>
+    <w:lvl w:ilvl="5" w:tentative="1">
+      <w:start w:val="1"/>
+      <w:numFmt w:val="bullet"/>
+      <w:lvlText w:val=""/>
+      <w:lvlJc w:val="left"/>
+      <w:pPr>
+        <w:tabs>
+          <w:tab w:val="num" w:pos="4320"/>
+        </w:tabs>
+        <w:ind w:left="4320" w:hanging="360"/>
+      </w:pPr>
+      <w:rPr>
+        <w:rFonts w:ascii="Wingdings" w:hAnsi="Wingdings" w:hint="default"/>
+        <w:sz w:val="20"/>
+      </w:rPr>
+    </w:lvl>
+    <w:lvl w:ilvl="6" w:tentative="1">
+      <w:start w:val="1"/>
+      <w:numFmt w:val="bullet"/>
+      <w:lvlText w:val=""/>
+      <w:lvlJc w:val="left"/>
+      <w:pPr>
+        <w:tabs>
+          <w:tab w:val="num" w:pos="5040"/>
+        </w:tabs>
+        <w:ind w:left="5040" w:hanging="360"/>
+      </w:pPr>
+      <w:rPr>
+        <w:rFonts w:ascii="Wingdings" w:hAnsi="Wingdings" w:hint="default"/>
+        <w:sz w:val="20"/>
+      </w:rPr>
+    </w:lvl>
+    <w:lvl w:ilvl="7" w:tentative="1">
+      <w:start w:val="1"/>
+      <w:numFmt w:val="bullet"/>
+      <w:lvlText w:val=""/>
+      <w:lvlJc w:val="left"/>
+      <w:pPr>
+        <w:tabs>
+          <w:tab w:val="num" w:pos="5760"/>
+        </w:tabs>
+        <w:ind w:left="5760" w:hanging="360"/>
+      </w:pPr>
+      <w:rPr>
+        <w:rFonts w:ascii="Wingdings" w:hAnsi="Wingdings" w:hint="default"/>
+        <w:sz w:val="20"/>
+      </w:rPr>
+    </w:lvl>
+    <w:lvl w:ilvl="8" w:tentative="1">
+      <w:start w:val="1"/>
+      <w:numFmt w:val="bullet"/>
+      <w:lvlText w:val=""/>
+      <w:lvlJc w:val="left"/>
+      <w:pPr>
+        <w:tabs>
+          <w:tab w:val="num" w:pos="6480"/>
+        </w:tabs>
+        <w:ind w:left="6480" w:hanging="360"/>
+      </w:pPr>
+      <w:rPr>
+        <w:rFonts w:ascii="Wingdings" w:hAnsi="Wingdings" w:hint="default"/>
+        <w:sz w:val="20"/>
+      </w:rPr>
+    </w:lvl>
+  </w:abstractNum>
+  <w:abstractNum w:abstractNumId="5" w15:restartNumberingAfterBreak="0">
     <w:nsid w:val="28FC132F"/>
     <w:multiLevelType w:val="multilevel"/>
     <w:tmpl w:val="53ECE566"/>
@@ -426,7 +1354,156 @@
       </w:rPr>
     </w:lvl>
   </w:abstractNum>
-  <w:abstractNum w:abstractNumId="3" w15:restartNumberingAfterBreak="0">
+  <w:abstractNum w:abstractNumId="6" w15:restartNumberingAfterBreak="0">
+    <w:nsid w:val="2D2E7EE0"/>
+    <w:multiLevelType w:val="multilevel"/>
+    <w:tmpl w:val="6FEC2F90"/>
+    <w:lvl w:ilvl="0">
+      <w:start w:val="1"/>
+      <w:numFmt w:val="bullet"/>
+      <w:lvlText w:val=""/>
+      <w:lvlJc w:val="left"/>
+      <w:pPr>
+        <w:tabs>
+          <w:tab w:val="num" w:pos="720"/>
+        </w:tabs>
+        <w:ind w:left="720" w:hanging="360"/>
+      </w:pPr>
+      <w:rPr>
+        <w:rFonts w:ascii="Symbol" w:hAnsi="Symbol" w:hint="default"/>
+        <w:sz w:val="20"/>
+      </w:rPr>
+    </w:lvl>
+    <w:lvl w:ilvl="1" w:tentative="1">
+      <w:start w:val="1"/>
+      <w:numFmt w:val="bullet"/>
+      <w:lvlText w:val="o"/>
+      <w:lvlJc w:val="left"/>
+      <w:pPr>
+        <w:tabs>
+          <w:tab w:val="num" w:pos="1440"/>
+        </w:tabs>
+        <w:ind w:left="1440" w:hanging="360"/>
+      </w:pPr>
+      <w:rPr>
+        <w:rFonts w:ascii="Courier New" w:hAnsi="Courier New" w:hint="default"/>
+        <w:sz w:val="20"/>
+      </w:rPr>
+    </w:lvl>
+    <w:lvl w:ilvl="2" w:tentative="1">
+      <w:start w:val="1"/>
+      <w:numFmt w:val="bullet"/>
+      <w:lvlText w:val=""/>
+      <w:lvlJc w:val="left"/>
+      <w:pPr>
+        <w:tabs>
+          <w:tab w:val="num" w:pos="2160"/>
+        </w:tabs>
+        <w:ind w:left="2160" w:hanging="360"/>
+      </w:pPr>
+      <w:rPr>
+        <w:rFonts w:ascii="Wingdings" w:hAnsi="Wingdings" w:hint="default"/>
+        <w:sz w:val="20"/>
+      </w:rPr>
+    </w:lvl>
+    <w:lvl w:ilvl="3" w:tentative="1">
+      <w:start w:val="1"/>
+      <w:numFmt w:val="bullet"/>
+      <w:lvlText w:val=""/>
+      <w:lvlJc w:val="left"/>
+      <w:pPr>
+        <w:tabs>
+          <w:tab w:val="num" w:pos="2880"/>
+        </w:tabs>
+        <w:ind w:left="2880" w:hanging="360"/>
+      </w:pPr>
+      <w:rPr>
+        <w:rFonts w:ascii="Wingdings" w:hAnsi="Wingdings" w:hint="default"/>
+        <w:sz w:val="20"/>
+      </w:rPr>
+    </w:lvl>
+    <w:lvl w:ilvl="4" w:tentative="1">
+      <w:start w:val="1"/>
+      <w:numFmt w:val="bullet"/>
+      <w:lvlText w:val=""/>
+      <w:lvlJc w:val="left"/>
+      <w:pPr>
+        <w:tabs>
+          <w:tab w:val="num" w:pos="3600"/>
+        </w:tabs>
+        <w:ind w:left="3600" w:hanging="360"/>
+      </w:pPr>
+      <w:rPr>
+        <w:rFonts w:ascii="Wingdings" w:hAnsi="Wingdings" w:hint="default"/>
+        <w:sz w:val="20"/>
+      </w:rPr>
+    </w:lvl>
+    <w:lvl w:ilvl="5" w:tentative="1">
+      <w:start w:val="1"/>
+      <w:numFmt w:val="bullet"/>
+      <w:lvlText w:val=""/>
+      <w:lvlJc w:val="left"/>
+      <w:pPr>
+        <w:tabs>
+          <w:tab w:val="num" w:pos="4320"/>
+        </w:tabs>
+        <w:ind w:left="4320" w:hanging="360"/>
+      </w:pPr>
+      <w:rPr>
+        <w:rFonts w:ascii="Wingdings" w:hAnsi="Wingdings" w:hint="default"/>
+        <w:sz w:val="20"/>
+      </w:rPr>
+    </w:lvl>
+    <w:lvl w:ilvl="6" w:tentative="1">
+      <w:start w:val="1"/>
+      <w:numFmt w:val="bullet"/>
+      <w:lvlText w:val=""/>
+      <w:lvlJc w:val="left"/>
+      <w:pPr>
+        <w:tabs>
+          <w:tab w:val="num" w:pos="5040"/>
+        </w:tabs>
+        <w:ind w:left="5040" w:hanging="360"/>
+      </w:pPr>
+      <w:rPr>
+        <w:rFonts w:ascii="Wingdings" w:hAnsi="Wingdings" w:hint="default"/>
+        <w:sz w:val="20"/>
+      </w:rPr>
+    </w:lvl>
+    <w:lvl w:ilvl="7" w:tentative="1">
+      <w:start w:val="1"/>
+      <w:numFmt w:val="bullet"/>
+      <w:lvlText w:val=""/>
+      <w:lvlJc w:val="left"/>
+      <w:pPr>
+        <w:tabs>
+          <w:tab w:val="num" w:pos="5760"/>
+        </w:tabs>
+        <w:ind w:left="5760" w:hanging="360"/>
+      </w:pPr>
+      <w:rPr>
+        <w:rFonts w:ascii="Wingdings" w:hAnsi="Wingdings" w:hint="default"/>
+        <w:sz w:val="20"/>
+      </w:rPr>
+    </w:lvl>
+    <w:lvl w:ilvl="8" w:tentative="1">
+      <w:start w:val="1"/>
+      <w:numFmt w:val="bullet"/>
+      <w:lvlText w:val=""/>
+      <w:lvlJc w:val="left"/>
+      <w:pPr>
+        <w:tabs>
+          <w:tab w:val="num" w:pos="6480"/>
+        </w:tabs>
+        <w:ind w:left="6480" w:hanging="360"/>
+      </w:pPr>
+      <w:rPr>
+        <w:rFonts w:ascii="Wingdings" w:hAnsi="Wingdings" w:hint="default"/>
+        <w:sz w:val="20"/>
+      </w:rPr>
+    </w:lvl>
+  </w:abstractNum>
+  <w:abstractNum w:abstractNumId="7" w15:restartNumberingAfterBreak="0">
     <w:nsid w:val="306F43FD"/>
     <w:multiLevelType w:val="multilevel"/>
     <w:tmpl w:val="EB524BCC"/>
@@ -539,7 +1616,7 @@
       </w:pPr>
     </w:lvl>
   </w:abstractNum>
-  <w:abstractNum w:abstractNumId="4" w15:restartNumberingAfterBreak="0">
+  <w:abstractNum w:abstractNumId="8" w15:restartNumberingAfterBreak="0">
     <w:nsid w:val="34444BDA"/>
     <w:multiLevelType w:val="multilevel"/>
     <w:tmpl w:val="4E5C9616"/>
@@ -688,7 +1765,305 @@
       </w:rPr>
     </w:lvl>
   </w:abstractNum>
-  <w:abstractNum w:abstractNumId="5" w15:restartNumberingAfterBreak="0">
+  <w:abstractNum w:abstractNumId="9" w15:restartNumberingAfterBreak="0">
+    <w:nsid w:val="35511E8B"/>
+    <w:multiLevelType w:val="multilevel"/>
+    <w:tmpl w:val="EC867DB4"/>
+    <w:lvl w:ilvl="0">
+      <w:start w:val="1"/>
+      <w:numFmt w:val="bullet"/>
+      <w:lvlText w:val=""/>
+      <w:lvlJc w:val="left"/>
+      <w:pPr>
+        <w:tabs>
+          <w:tab w:val="num" w:pos="720"/>
+        </w:tabs>
+        <w:ind w:left="720" w:hanging="360"/>
+      </w:pPr>
+      <w:rPr>
+        <w:rFonts w:ascii="Symbol" w:hAnsi="Symbol" w:hint="default"/>
+        <w:sz w:val="20"/>
+      </w:rPr>
+    </w:lvl>
+    <w:lvl w:ilvl="1" w:tentative="1">
+      <w:start w:val="1"/>
+      <w:numFmt w:val="bullet"/>
+      <w:lvlText w:val="o"/>
+      <w:lvlJc w:val="left"/>
+      <w:pPr>
+        <w:tabs>
+          <w:tab w:val="num" w:pos="1440"/>
+        </w:tabs>
+        <w:ind w:left="1440" w:hanging="360"/>
+      </w:pPr>
+      <w:rPr>
+        <w:rFonts w:ascii="Courier New" w:hAnsi="Courier New" w:hint="default"/>
+        <w:sz w:val="20"/>
+      </w:rPr>
+    </w:lvl>
+    <w:lvl w:ilvl="2" w:tentative="1">
+      <w:start w:val="1"/>
+      <w:numFmt w:val="bullet"/>
+      <w:lvlText w:val=""/>
+      <w:lvlJc w:val="left"/>
+      <w:pPr>
+        <w:tabs>
+          <w:tab w:val="num" w:pos="2160"/>
+        </w:tabs>
+        <w:ind w:left="2160" w:hanging="360"/>
+      </w:pPr>
+      <w:rPr>
+        <w:rFonts w:ascii="Wingdings" w:hAnsi="Wingdings" w:hint="default"/>
+        <w:sz w:val="20"/>
+      </w:rPr>
+    </w:lvl>
+    <w:lvl w:ilvl="3" w:tentative="1">
+      <w:start w:val="1"/>
+      <w:numFmt w:val="bullet"/>
+      <w:lvlText w:val=""/>
+      <w:lvlJc w:val="left"/>
+      <w:pPr>
+        <w:tabs>
+          <w:tab w:val="num" w:pos="2880"/>
+        </w:tabs>
+        <w:ind w:left="2880" w:hanging="360"/>
+      </w:pPr>
+      <w:rPr>
+        <w:rFonts w:ascii="Wingdings" w:hAnsi="Wingdings" w:hint="default"/>
+        <w:sz w:val="20"/>
+      </w:rPr>
+    </w:lvl>
+    <w:lvl w:ilvl="4" w:tentative="1">
+      <w:start w:val="1"/>
+      <w:numFmt w:val="bullet"/>
+      <w:lvlText w:val=""/>
+      <w:lvlJc w:val="left"/>
+      <w:pPr>
+        <w:tabs>
+          <w:tab w:val="num" w:pos="3600"/>
+        </w:tabs>
+        <w:ind w:left="3600" w:hanging="360"/>
+      </w:pPr>
+      <w:rPr>
+        <w:rFonts w:ascii="Wingdings" w:hAnsi="Wingdings" w:hint="default"/>
+        <w:sz w:val="20"/>
+      </w:rPr>
+    </w:lvl>
+    <w:lvl w:ilvl="5" w:tentative="1">
+      <w:start w:val="1"/>
+      <w:numFmt w:val="bullet"/>
+      <w:lvlText w:val=""/>
+      <w:lvlJc w:val="left"/>
+      <w:pPr>
+        <w:tabs>
+          <w:tab w:val="num" w:pos="4320"/>
+        </w:tabs>
+        <w:ind w:left="4320" w:hanging="360"/>
+      </w:pPr>
+      <w:rPr>
+        <w:rFonts w:ascii="Wingdings" w:hAnsi="Wingdings" w:hint="default"/>
+        <w:sz w:val="20"/>
+      </w:rPr>
+    </w:lvl>
+    <w:lvl w:ilvl="6" w:tentative="1">
+      <w:start w:val="1"/>
+      <w:numFmt w:val="bullet"/>
+      <w:lvlText w:val=""/>
+      <w:lvlJc w:val="left"/>
+      <w:pPr>
+        <w:tabs>
+          <w:tab w:val="num" w:pos="5040"/>
+        </w:tabs>
+        <w:ind w:left="5040" w:hanging="360"/>
+      </w:pPr>
+      <w:rPr>
+        <w:rFonts w:ascii="Wingdings" w:hAnsi="Wingdings" w:hint="default"/>
+        <w:sz w:val="20"/>
+      </w:rPr>
+    </w:lvl>
+    <w:lvl w:ilvl="7" w:tentative="1">
+      <w:start w:val="1"/>
+      <w:numFmt w:val="bullet"/>
+      <w:lvlText w:val=""/>
+      <w:lvlJc w:val="left"/>
+      <w:pPr>
+        <w:tabs>
+          <w:tab w:val="num" w:pos="5760"/>
+        </w:tabs>
+        <w:ind w:left="5760" w:hanging="360"/>
+      </w:pPr>
+      <w:rPr>
+        <w:rFonts w:ascii="Wingdings" w:hAnsi="Wingdings" w:hint="default"/>
+        <w:sz w:val="20"/>
+      </w:rPr>
+    </w:lvl>
+    <w:lvl w:ilvl="8" w:tentative="1">
+      <w:start w:val="1"/>
+      <w:numFmt w:val="bullet"/>
+      <w:lvlText w:val=""/>
+      <w:lvlJc w:val="left"/>
+      <w:pPr>
+        <w:tabs>
+          <w:tab w:val="num" w:pos="6480"/>
+        </w:tabs>
+        <w:ind w:left="6480" w:hanging="360"/>
+      </w:pPr>
+      <w:rPr>
+        <w:rFonts w:ascii="Wingdings" w:hAnsi="Wingdings" w:hint="default"/>
+        <w:sz w:val="20"/>
+      </w:rPr>
+    </w:lvl>
+  </w:abstractNum>
+  <w:abstractNum w:abstractNumId="10" w15:restartNumberingAfterBreak="0">
+    <w:nsid w:val="42207CCE"/>
+    <w:multiLevelType w:val="multilevel"/>
+    <w:tmpl w:val="7EB0C652"/>
+    <w:lvl w:ilvl="0">
+      <w:start w:val="1"/>
+      <w:numFmt w:val="bullet"/>
+      <w:lvlText w:val=""/>
+      <w:lvlJc w:val="left"/>
+      <w:pPr>
+        <w:tabs>
+          <w:tab w:val="num" w:pos="720"/>
+        </w:tabs>
+        <w:ind w:left="720" w:hanging="360"/>
+      </w:pPr>
+      <w:rPr>
+        <w:rFonts w:ascii="Symbol" w:hAnsi="Symbol" w:hint="default"/>
+        <w:sz w:val="20"/>
+      </w:rPr>
+    </w:lvl>
+    <w:lvl w:ilvl="1" w:tentative="1">
+      <w:start w:val="1"/>
+      <w:numFmt w:val="bullet"/>
+      <w:lvlText w:val="o"/>
+      <w:lvlJc w:val="left"/>
+      <w:pPr>
+        <w:tabs>
+          <w:tab w:val="num" w:pos="1440"/>
+        </w:tabs>
+        <w:ind w:left="1440" w:hanging="360"/>
+      </w:pPr>
+      <w:rPr>
+        <w:rFonts w:ascii="Courier New" w:hAnsi="Courier New" w:hint="default"/>
+        <w:sz w:val="20"/>
+      </w:rPr>
+    </w:lvl>
+    <w:lvl w:ilvl="2" w:tentative="1">
+      <w:start w:val="1"/>
+      <w:numFmt w:val="bullet"/>
+      <w:lvlText w:val=""/>
+      <w:lvlJc w:val="left"/>
+      <w:pPr>
+        <w:tabs>
+          <w:tab w:val="num" w:pos="2160"/>
+        </w:tabs>
+        <w:ind w:left="2160" w:hanging="360"/>
+      </w:pPr>
+      <w:rPr>
+        <w:rFonts w:ascii="Wingdings" w:hAnsi="Wingdings" w:hint="default"/>
+        <w:sz w:val="20"/>
+      </w:rPr>
+    </w:lvl>
+    <w:lvl w:ilvl="3" w:tentative="1">
+      <w:start w:val="1"/>
+      <w:numFmt w:val="bullet"/>
+      <w:lvlText w:val=""/>
+      <w:lvlJc w:val="left"/>
+      <w:pPr>
+        <w:tabs>
+          <w:tab w:val="num" w:pos="2880"/>
+        </w:tabs>
+        <w:ind w:left="2880" w:hanging="360"/>
+      </w:pPr>
+      <w:rPr>
+        <w:rFonts w:ascii="Wingdings" w:hAnsi="Wingdings" w:hint="default"/>
+        <w:sz w:val="20"/>
+      </w:rPr>
+    </w:lvl>
+    <w:lvl w:ilvl="4" w:tentative="1">
+      <w:start w:val="1"/>
+      <w:numFmt w:val="bullet"/>
+      <w:lvlText w:val=""/>
+      <w:lvlJc w:val="left"/>
+      <w:pPr>
+        <w:tabs>
+          <w:tab w:val="num" w:pos="3600"/>
+        </w:tabs>
+        <w:ind w:left="3600" w:hanging="360"/>
+      </w:pPr>
+      <w:rPr>
+        <w:rFonts w:ascii="Wingdings" w:hAnsi="Wingdings" w:hint="default"/>
+        <w:sz w:val="20"/>
+      </w:rPr>
+    </w:lvl>
+    <w:lvl w:ilvl="5" w:tentative="1">
+      <w:start w:val="1"/>
+      <w:numFmt w:val="bullet"/>
+      <w:lvlText w:val=""/>
+      <w:lvlJc w:val="left"/>
+      <w:pPr>
+        <w:tabs>
+          <w:tab w:val="num" w:pos="4320"/>
+        </w:tabs>
+        <w:ind w:left="4320" w:hanging="360"/>
+      </w:pPr>
+      <w:rPr>
+        <w:rFonts w:ascii="Wingdings" w:hAnsi="Wingdings" w:hint="default"/>
+        <w:sz w:val="20"/>
+      </w:rPr>
+    </w:lvl>
+    <w:lvl w:ilvl="6" w:tentative="1">
+      <w:start w:val="1"/>
+      <w:numFmt w:val="bullet"/>
+      <w:lvlText w:val=""/>
+      <w:lvlJc w:val="left"/>
+      <w:pPr>
+        <w:tabs>
+          <w:tab w:val="num" w:pos="5040"/>
+        </w:tabs>
+        <w:ind w:left="5040" w:hanging="360"/>
+      </w:pPr>
+      <w:rPr>
+        <w:rFonts w:ascii="Wingdings" w:hAnsi="Wingdings" w:hint="default"/>
+        <w:sz w:val="20"/>
+      </w:rPr>
+    </w:lvl>
+    <w:lvl w:ilvl="7" w:tentative="1">
+      <w:start w:val="1"/>
+      <w:numFmt w:val="bullet"/>
+      <w:lvlText w:val=""/>
+      <w:lvlJc w:val="left"/>
+      <w:pPr>
+        <w:tabs>
+          <w:tab w:val="num" w:pos="5760"/>
+        </w:tabs>
+        <w:ind w:left="5760" w:hanging="360"/>
+      </w:pPr>
+      <w:rPr>
+        <w:rFonts w:ascii="Wingdings" w:hAnsi="Wingdings" w:hint="default"/>
+        <w:sz w:val="20"/>
+      </w:rPr>
+    </w:lvl>
+    <w:lvl w:ilvl="8" w:tentative="1">
+      <w:start w:val="1"/>
+      <w:numFmt w:val="bullet"/>
+      <w:lvlText w:val=""/>
+      <w:lvlJc w:val="left"/>
+      <w:pPr>
+        <w:tabs>
+          <w:tab w:val="num" w:pos="6480"/>
+        </w:tabs>
+        <w:ind w:left="6480" w:hanging="360"/>
+      </w:pPr>
+      <w:rPr>
+        <w:rFonts w:ascii="Wingdings" w:hAnsi="Wingdings" w:hint="default"/>
+        <w:sz w:val="20"/>
+      </w:rPr>
+    </w:lvl>
+  </w:abstractNum>
+  <w:abstractNum w:abstractNumId="11" w15:restartNumberingAfterBreak="0">
     <w:nsid w:val="444D0843"/>
     <w:multiLevelType w:val="multilevel"/>
     <w:tmpl w:val="415A6F28"/>
@@ -801,7 +2176,7 @@
       </w:pPr>
     </w:lvl>
   </w:abstractNum>
-  <w:abstractNum w:abstractNumId="6" w15:restartNumberingAfterBreak="0">
+  <w:abstractNum w:abstractNumId="12" w15:restartNumberingAfterBreak="0">
     <w:nsid w:val="4B8D1234"/>
     <w:multiLevelType w:val="multilevel"/>
     <w:tmpl w:val="2B863BC4"/>
@@ -950,7 +2325,7 @@
       </w:rPr>
     </w:lvl>
   </w:abstractNum>
-  <w:abstractNum w:abstractNumId="7" w15:restartNumberingAfterBreak="0">
+  <w:abstractNum w:abstractNumId="13" w15:restartNumberingAfterBreak="0">
     <w:nsid w:val="4C32572B"/>
     <w:multiLevelType w:val="multilevel"/>
     <w:tmpl w:val="8DB6ED7C"/>
@@ -1063,7 +2438,305 @@
       </w:pPr>
     </w:lvl>
   </w:abstractNum>
-  <w:abstractNum w:abstractNumId="8" w15:restartNumberingAfterBreak="0">
+  <w:abstractNum w:abstractNumId="14" w15:restartNumberingAfterBreak="0">
+    <w:nsid w:val="4F4C581B"/>
+    <w:multiLevelType w:val="multilevel"/>
+    <w:tmpl w:val="A2F2BACA"/>
+    <w:lvl w:ilvl="0">
+      <w:start w:val="1"/>
+      <w:numFmt w:val="bullet"/>
+      <w:lvlText w:val=""/>
+      <w:lvlJc w:val="left"/>
+      <w:pPr>
+        <w:tabs>
+          <w:tab w:val="num" w:pos="720"/>
+        </w:tabs>
+        <w:ind w:left="720" w:hanging="360"/>
+      </w:pPr>
+      <w:rPr>
+        <w:rFonts w:ascii="Symbol" w:hAnsi="Symbol" w:hint="default"/>
+        <w:sz w:val="20"/>
+      </w:rPr>
+    </w:lvl>
+    <w:lvl w:ilvl="1" w:tentative="1">
+      <w:start w:val="1"/>
+      <w:numFmt w:val="bullet"/>
+      <w:lvlText w:val="o"/>
+      <w:lvlJc w:val="left"/>
+      <w:pPr>
+        <w:tabs>
+          <w:tab w:val="num" w:pos="1440"/>
+        </w:tabs>
+        <w:ind w:left="1440" w:hanging="360"/>
+      </w:pPr>
+      <w:rPr>
+        <w:rFonts w:ascii="Courier New" w:hAnsi="Courier New" w:hint="default"/>
+        <w:sz w:val="20"/>
+      </w:rPr>
+    </w:lvl>
+    <w:lvl w:ilvl="2" w:tentative="1">
+      <w:start w:val="1"/>
+      <w:numFmt w:val="bullet"/>
+      <w:lvlText w:val=""/>
+      <w:lvlJc w:val="left"/>
+      <w:pPr>
+        <w:tabs>
+          <w:tab w:val="num" w:pos="2160"/>
+        </w:tabs>
+        <w:ind w:left="2160" w:hanging="360"/>
+      </w:pPr>
+      <w:rPr>
+        <w:rFonts w:ascii="Wingdings" w:hAnsi="Wingdings" w:hint="default"/>
+        <w:sz w:val="20"/>
+      </w:rPr>
+    </w:lvl>
+    <w:lvl w:ilvl="3" w:tentative="1">
+      <w:start w:val="1"/>
+      <w:numFmt w:val="bullet"/>
+      <w:lvlText w:val=""/>
+      <w:lvlJc w:val="left"/>
+      <w:pPr>
+        <w:tabs>
+          <w:tab w:val="num" w:pos="2880"/>
+        </w:tabs>
+        <w:ind w:left="2880" w:hanging="360"/>
+      </w:pPr>
+      <w:rPr>
+        <w:rFonts w:ascii="Wingdings" w:hAnsi="Wingdings" w:hint="default"/>
+        <w:sz w:val="20"/>
+      </w:rPr>
+    </w:lvl>
+    <w:lvl w:ilvl="4" w:tentative="1">
+      <w:start w:val="1"/>
+      <w:numFmt w:val="bullet"/>
+      <w:lvlText w:val=""/>
+      <w:lvlJc w:val="left"/>
+      <w:pPr>
+        <w:tabs>
+          <w:tab w:val="num" w:pos="3600"/>
+        </w:tabs>
+        <w:ind w:left="3600" w:hanging="360"/>
+      </w:pPr>
+      <w:rPr>
+        <w:rFonts w:ascii="Wingdings" w:hAnsi="Wingdings" w:hint="default"/>
+        <w:sz w:val="20"/>
+      </w:rPr>
+    </w:lvl>
+    <w:lvl w:ilvl="5" w:tentative="1">
+      <w:start w:val="1"/>
+      <w:numFmt w:val="bullet"/>
+      <w:lvlText w:val=""/>
+      <w:lvlJc w:val="left"/>
+      <w:pPr>
+        <w:tabs>
+          <w:tab w:val="num" w:pos="4320"/>
+        </w:tabs>
+        <w:ind w:left="4320" w:hanging="360"/>
+      </w:pPr>
+      <w:rPr>
+        <w:rFonts w:ascii="Wingdings" w:hAnsi="Wingdings" w:hint="default"/>
+        <w:sz w:val="20"/>
+      </w:rPr>
+    </w:lvl>
+    <w:lvl w:ilvl="6" w:tentative="1">
+      <w:start w:val="1"/>
+      <w:numFmt w:val="bullet"/>
+      <w:lvlText w:val=""/>
+      <w:lvlJc w:val="left"/>
+      <w:pPr>
+        <w:tabs>
+          <w:tab w:val="num" w:pos="5040"/>
+        </w:tabs>
+        <w:ind w:left="5040" w:hanging="360"/>
+      </w:pPr>
+      <w:rPr>
+        <w:rFonts w:ascii="Wingdings" w:hAnsi="Wingdings" w:hint="default"/>
+        <w:sz w:val="20"/>
+      </w:rPr>
+    </w:lvl>
+    <w:lvl w:ilvl="7" w:tentative="1">
+      <w:start w:val="1"/>
+      <w:numFmt w:val="bullet"/>
+      <w:lvlText w:val=""/>
+      <w:lvlJc w:val="left"/>
+      <w:pPr>
+        <w:tabs>
+          <w:tab w:val="num" w:pos="5760"/>
+        </w:tabs>
+        <w:ind w:left="5760" w:hanging="360"/>
+      </w:pPr>
+      <w:rPr>
+        <w:rFonts w:ascii="Wingdings" w:hAnsi="Wingdings" w:hint="default"/>
+        <w:sz w:val="20"/>
+      </w:rPr>
+    </w:lvl>
+    <w:lvl w:ilvl="8" w:tentative="1">
+      <w:start w:val="1"/>
+      <w:numFmt w:val="bullet"/>
+      <w:lvlText w:val=""/>
+      <w:lvlJc w:val="left"/>
+      <w:pPr>
+        <w:tabs>
+          <w:tab w:val="num" w:pos="6480"/>
+        </w:tabs>
+        <w:ind w:left="6480" w:hanging="360"/>
+      </w:pPr>
+      <w:rPr>
+        <w:rFonts w:ascii="Wingdings" w:hAnsi="Wingdings" w:hint="default"/>
+        <w:sz w:val="20"/>
+      </w:rPr>
+    </w:lvl>
+  </w:abstractNum>
+  <w:abstractNum w:abstractNumId="15" w15:restartNumberingAfterBreak="0">
+    <w:nsid w:val="56EC6741"/>
+    <w:multiLevelType w:val="multilevel"/>
+    <w:tmpl w:val="E1BED028"/>
+    <w:lvl w:ilvl="0">
+      <w:start w:val="1"/>
+      <w:numFmt w:val="bullet"/>
+      <w:lvlText w:val=""/>
+      <w:lvlJc w:val="left"/>
+      <w:pPr>
+        <w:tabs>
+          <w:tab w:val="num" w:pos="720"/>
+        </w:tabs>
+        <w:ind w:left="720" w:hanging="360"/>
+      </w:pPr>
+      <w:rPr>
+        <w:rFonts w:ascii="Symbol" w:hAnsi="Symbol" w:hint="default"/>
+        <w:sz w:val="20"/>
+      </w:rPr>
+    </w:lvl>
+    <w:lvl w:ilvl="1" w:tentative="1">
+      <w:start w:val="1"/>
+      <w:numFmt w:val="bullet"/>
+      <w:lvlText w:val="o"/>
+      <w:lvlJc w:val="left"/>
+      <w:pPr>
+        <w:tabs>
+          <w:tab w:val="num" w:pos="1440"/>
+        </w:tabs>
+        <w:ind w:left="1440" w:hanging="360"/>
+      </w:pPr>
+      <w:rPr>
+        <w:rFonts w:ascii="Courier New" w:hAnsi="Courier New" w:hint="default"/>
+        <w:sz w:val="20"/>
+      </w:rPr>
+    </w:lvl>
+    <w:lvl w:ilvl="2" w:tentative="1">
+      <w:start w:val="1"/>
+      <w:numFmt w:val="bullet"/>
+      <w:lvlText w:val=""/>
+      <w:lvlJc w:val="left"/>
+      <w:pPr>
+        <w:tabs>
+          <w:tab w:val="num" w:pos="2160"/>
+        </w:tabs>
+        <w:ind w:left="2160" w:hanging="360"/>
+      </w:pPr>
+      <w:rPr>
+        <w:rFonts w:ascii="Wingdings" w:hAnsi="Wingdings" w:hint="default"/>
+        <w:sz w:val="20"/>
+      </w:rPr>
+    </w:lvl>
+    <w:lvl w:ilvl="3" w:tentative="1">
+      <w:start w:val="1"/>
+      <w:numFmt w:val="bullet"/>
+      <w:lvlText w:val=""/>
+      <w:lvlJc w:val="left"/>
+      <w:pPr>
+        <w:tabs>
+          <w:tab w:val="num" w:pos="2880"/>
+        </w:tabs>
+        <w:ind w:left="2880" w:hanging="360"/>
+      </w:pPr>
+      <w:rPr>
+        <w:rFonts w:ascii="Wingdings" w:hAnsi="Wingdings" w:hint="default"/>
+        <w:sz w:val="20"/>
+      </w:rPr>
+    </w:lvl>
+    <w:lvl w:ilvl="4" w:tentative="1">
+      <w:start w:val="1"/>
+      <w:numFmt w:val="bullet"/>
+      <w:lvlText w:val=""/>
+      <w:lvlJc w:val="left"/>
+      <w:pPr>
+        <w:tabs>
+          <w:tab w:val="num" w:pos="3600"/>
+        </w:tabs>
+        <w:ind w:left="3600" w:hanging="360"/>
+      </w:pPr>
+      <w:rPr>
+        <w:rFonts w:ascii="Wingdings" w:hAnsi="Wingdings" w:hint="default"/>
+        <w:sz w:val="20"/>
+      </w:rPr>
+    </w:lvl>
+    <w:lvl w:ilvl="5" w:tentative="1">
+      <w:start w:val="1"/>
+      <w:numFmt w:val="bullet"/>
+      <w:lvlText w:val=""/>
+      <w:lvlJc w:val="left"/>
+      <w:pPr>
+        <w:tabs>
+          <w:tab w:val="num" w:pos="4320"/>
+        </w:tabs>
+        <w:ind w:left="4320" w:hanging="360"/>
+      </w:pPr>
+      <w:rPr>
+        <w:rFonts w:ascii="Wingdings" w:hAnsi="Wingdings" w:hint="default"/>
+        <w:sz w:val="20"/>
+      </w:rPr>
+    </w:lvl>
+    <w:lvl w:ilvl="6" w:tentative="1">
+      <w:start w:val="1"/>
+      <w:numFmt w:val="bullet"/>
+      <w:lvlText w:val=""/>
+      <w:lvlJc w:val="left"/>
+      <w:pPr>
+        <w:tabs>
+          <w:tab w:val="num" w:pos="5040"/>
+        </w:tabs>
+        <w:ind w:left="5040" w:hanging="360"/>
+      </w:pPr>
+      <w:rPr>
+        <w:rFonts w:ascii="Wingdings" w:hAnsi="Wingdings" w:hint="default"/>
+        <w:sz w:val="20"/>
+      </w:rPr>
+    </w:lvl>
+    <w:lvl w:ilvl="7" w:tentative="1">
+      <w:start w:val="1"/>
+      <w:numFmt w:val="bullet"/>
+      <w:lvlText w:val=""/>
+      <w:lvlJc w:val="left"/>
+      <w:pPr>
+        <w:tabs>
+          <w:tab w:val="num" w:pos="5760"/>
+        </w:tabs>
+        <w:ind w:left="5760" w:hanging="360"/>
+      </w:pPr>
+      <w:rPr>
+        <w:rFonts w:ascii="Wingdings" w:hAnsi="Wingdings" w:hint="default"/>
+        <w:sz w:val="20"/>
+      </w:rPr>
+    </w:lvl>
+    <w:lvl w:ilvl="8" w:tentative="1">
+      <w:start w:val="1"/>
+      <w:numFmt w:val="bullet"/>
+      <w:lvlText w:val=""/>
+      <w:lvlJc w:val="left"/>
+      <w:pPr>
+        <w:tabs>
+          <w:tab w:val="num" w:pos="6480"/>
+        </w:tabs>
+        <w:ind w:left="6480" w:hanging="360"/>
+      </w:pPr>
+      <w:rPr>
+        <w:rFonts w:ascii="Wingdings" w:hAnsi="Wingdings" w:hint="default"/>
+        <w:sz w:val="20"/>
+      </w:rPr>
+    </w:lvl>
+  </w:abstractNum>
+  <w:abstractNum w:abstractNumId="16" w15:restartNumberingAfterBreak="0">
     <w:nsid w:val="57AE0478"/>
     <w:multiLevelType w:val="multilevel"/>
     <w:tmpl w:val="373200E6"/>
@@ -1212,7 +2885,7 @@
       </w:rPr>
     </w:lvl>
   </w:abstractNum>
-  <w:abstractNum w:abstractNumId="9" w15:restartNumberingAfterBreak="0">
+  <w:abstractNum w:abstractNumId="17" w15:restartNumberingAfterBreak="0">
     <w:nsid w:val="5A647007"/>
     <w:multiLevelType w:val="multilevel"/>
     <w:tmpl w:val="1A4C4B70"/>
@@ -1361,7 +3034,7 @@
       </w:rPr>
     </w:lvl>
   </w:abstractNum>
-  <w:abstractNum w:abstractNumId="10" w15:restartNumberingAfterBreak="0">
+  <w:abstractNum w:abstractNumId="18" w15:restartNumberingAfterBreak="0">
     <w:nsid w:val="5CB72FF1"/>
     <w:multiLevelType w:val="multilevel"/>
     <w:tmpl w:val="00761330"/>
@@ -1510,7 +3183,7 @@
       </w:rPr>
     </w:lvl>
   </w:abstractNum>
-  <w:abstractNum w:abstractNumId="11" w15:restartNumberingAfterBreak="0">
+  <w:abstractNum w:abstractNumId="19" w15:restartNumberingAfterBreak="0">
     <w:nsid w:val="663D02EF"/>
     <w:multiLevelType w:val="multilevel"/>
     <w:tmpl w:val="93687440"/>
@@ -1623,7 +3296,206 @@
       </w:pPr>
     </w:lvl>
   </w:abstractNum>
-  <w:abstractNum w:abstractNumId="12" w15:restartNumberingAfterBreak="0">
+  <w:abstractNum w:abstractNumId="20" w15:restartNumberingAfterBreak="0">
+    <w:nsid w:val="7617338C"/>
+    <w:multiLevelType w:val="hybridMultilevel"/>
+    <w:tmpl w:val="6A1C0E60"/>
+    <w:lvl w:ilvl="0" w:tplc="08090001">
+      <w:start w:val="1"/>
+      <w:numFmt w:val="bullet"/>
+      <w:lvlText w:val=""/>
+      <w:lvlJc w:val="left"/>
+      <w:pPr>
+        <w:ind w:left="720" w:hanging="360"/>
+      </w:pPr>
+      <w:rPr>
+        <w:rFonts w:ascii="Symbol" w:hAnsi="Symbol" w:hint="default"/>
+      </w:rPr>
+    </w:lvl>
+    <w:lvl w:ilvl="1" w:tplc="08090003" w:tentative="1">
+      <w:start w:val="1"/>
+      <w:numFmt w:val="bullet"/>
+      <w:lvlText w:val="o"/>
+      <w:lvlJc w:val="left"/>
+      <w:pPr>
+        <w:ind w:left="1440" w:hanging="360"/>
+      </w:pPr>
+      <w:rPr>
+        <w:rFonts w:ascii="Courier New" w:hAnsi="Courier New" w:cs="Courier New" w:hint="default"/>
+      </w:rPr>
+    </w:lvl>
+    <w:lvl w:ilvl="2" w:tplc="08090005" w:tentative="1">
+      <w:start w:val="1"/>
+      <w:numFmt w:val="bullet"/>
+      <w:lvlText w:val=""/>
+      <w:lvlJc w:val="left"/>
+      <w:pPr>
+        <w:ind w:left="2160" w:hanging="360"/>
+      </w:pPr>
+      <w:rPr>
+        <w:rFonts w:ascii="Wingdings" w:hAnsi="Wingdings" w:hint="default"/>
+      </w:rPr>
+    </w:lvl>
+    <w:lvl w:ilvl="3" w:tplc="08090001" w:tentative="1">
+      <w:start w:val="1"/>
+      <w:numFmt w:val="bullet"/>
+      <w:lvlText w:val=""/>
+      <w:lvlJc w:val="left"/>
+      <w:pPr>
+        <w:ind w:left="2880" w:hanging="360"/>
+      </w:pPr>
+      <w:rPr>
+        <w:rFonts w:ascii="Symbol" w:hAnsi="Symbol" w:hint="default"/>
+      </w:rPr>
+    </w:lvl>
+    <w:lvl w:ilvl="4" w:tplc="08090003" w:tentative="1">
+      <w:start w:val="1"/>
+      <w:numFmt w:val="bullet"/>
+      <w:lvlText w:val="o"/>
+      <w:lvlJc w:val="left"/>
+      <w:pPr>
+        <w:ind w:left="3600" w:hanging="360"/>
+      </w:pPr>
+      <w:rPr>
+        <w:rFonts w:ascii="Courier New" w:hAnsi="Courier New" w:cs="Courier New" w:hint="default"/>
+      </w:rPr>
+    </w:lvl>
+    <w:lvl w:ilvl="5" w:tplc="08090005" w:tentative="1">
+      <w:start w:val="1"/>
+      <w:numFmt w:val="bullet"/>
+      <w:lvlText w:val=""/>
+      <w:lvlJc w:val="left"/>
+      <w:pPr>
+        <w:ind w:left="4320" w:hanging="360"/>
+      </w:pPr>
+      <w:rPr>
+        <w:rFonts w:ascii="Wingdings" w:hAnsi="Wingdings" w:hint="default"/>
+      </w:rPr>
+    </w:lvl>
+    <w:lvl w:ilvl="6" w:tplc="08090001" w:tentative="1">
+      <w:start w:val="1"/>
+      <w:numFmt w:val="bullet"/>
+      <w:lvlText w:val=""/>
+      <w:lvlJc w:val="left"/>
+      <w:pPr>
+        <w:ind w:left="5040" w:hanging="360"/>
+      </w:pPr>
+      <w:rPr>
+        <w:rFonts w:ascii="Symbol" w:hAnsi="Symbol" w:hint="default"/>
+      </w:rPr>
+    </w:lvl>
+    <w:lvl w:ilvl="7" w:tplc="08090003" w:tentative="1">
+      <w:start w:val="1"/>
+      <w:numFmt w:val="bullet"/>
+      <w:lvlText w:val="o"/>
+      <w:lvlJc w:val="left"/>
+      <w:pPr>
+        <w:ind w:left="5760" w:hanging="360"/>
+      </w:pPr>
+      <w:rPr>
+        <w:rFonts w:ascii="Courier New" w:hAnsi="Courier New" w:cs="Courier New" w:hint="default"/>
+      </w:rPr>
+    </w:lvl>
+    <w:lvl w:ilvl="8" w:tplc="08090005" w:tentative="1">
+      <w:start w:val="1"/>
+      <w:numFmt w:val="bullet"/>
+      <w:lvlText w:val=""/>
+      <w:lvlJc w:val="left"/>
+      <w:pPr>
+        <w:ind w:left="6480" w:hanging="360"/>
+      </w:pPr>
+      <w:rPr>
+        <w:rFonts w:ascii="Wingdings" w:hAnsi="Wingdings" w:hint="default"/>
+      </w:rPr>
+    </w:lvl>
+  </w:abstractNum>
+  <w:abstractNum w:abstractNumId="21" w15:restartNumberingAfterBreak="0">
+    <w:nsid w:val="79201DAF"/>
+    <w:multiLevelType w:val="hybridMultilevel"/>
+    <w:tmpl w:val="F594F916"/>
+    <w:lvl w:ilvl="0" w:tplc="0809000F">
+      <w:start w:val="1"/>
+      <w:numFmt w:val="decimal"/>
+      <w:lvlText w:val="%1."/>
+      <w:lvlJc w:val="left"/>
+      <w:pPr>
+        <w:ind w:left="720" w:hanging="360"/>
+      </w:pPr>
+    </w:lvl>
+    <w:lvl w:ilvl="1" w:tplc="08090019">
+      <w:start w:val="1"/>
+      <w:numFmt w:val="lowerLetter"/>
+      <w:lvlText w:val="%2."/>
+      <w:lvlJc w:val="left"/>
+      <w:pPr>
+        <w:ind w:left="1440" w:hanging="360"/>
+      </w:pPr>
+    </w:lvl>
+    <w:lvl w:ilvl="2" w:tplc="0809001B" w:tentative="1">
+      <w:start w:val="1"/>
+      <w:numFmt w:val="lowerRoman"/>
+      <w:lvlText w:val="%3."/>
+      <w:lvlJc w:val="right"/>
+      <w:pPr>
+        <w:ind w:left="2160" w:hanging="180"/>
+      </w:pPr>
+    </w:lvl>
+    <w:lvl w:ilvl="3" w:tplc="0809000F" w:tentative="1">
+      <w:start w:val="1"/>
+      <w:numFmt w:val="decimal"/>
+      <w:lvlText w:val="%4."/>
+      <w:lvlJc w:val="left"/>
+      <w:pPr>
+        <w:ind w:left="2880" w:hanging="360"/>
+      </w:pPr>
+    </w:lvl>
+    <w:lvl w:ilvl="4" w:tplc="08090019" w:tentative="1">
+      <w:start w:val="1"/>
+      <w:numFmt w:val="lowerLetter"/>
+      <w:lvlText w:val="%5."/>
+      <w:lvlJc w:val="left"/>
+      <w:pPr>
+        <w:ind w:left="3600" w:hanging="360"/>
+      </w:pPr>
+    </w:lvl>
+    <w:lvl w:ilvl="5" w:tplc="0809001B" w:tentative="1">
+      <w:start w:val="1"/>
+      <w:numFmt w:val="lowerRoman"/>
+      <w:lvlText w:val="%6."/>
+      <w:lvlJc w:val="right"/>
+      <w:pPr>
+        <w:ind w:left="4320" w:hanging="180"/>
+      </w:pPr>
+    </w:lvl>
+    <w:lvl w:ilvl="6" w:tplc="0809000F" w:tentative="1">
+      <w:start w:val="1"/>
+      <w:numFmt w:val="decimal"/>
+      <w:lvlText w:val="%7."/>
+      <w:lvlJc w:val="left"/>
+      <w:pPr>
+        <w:ind w:left="5040" w:hanging="360"/>
+      </w:pPr>
+    </w:lvl>
+    <w:lvl w:ilvl="7" w:tplc="08090019" w:tentative="1">
+      <w:start w:val="1"/>
+      <w:numFmt w:val="lowerLetter"/>
+      <w:lvlText w:val="%8."/>
+      <w:lvlJc w:val="left"/>
+      <w:pPr>
+        <w:ind w:left="5760" w:hanging="360"/>
+      </w:pPr>
+    </w:lvl>
+    <w:lvl w:ilvl="8" w:tplc="0809001B" w:tentative="1">
+      <w:start w:val="1"/>
+      <w:numFmt w:val="lowerRoman"/>
+      <w:lvlText w:val="%9."/>
+      <w:lvlJc w:val="right"/>
+      <w:pPr>
+        <w:ind w:left="6480" w:hanging="180"/>
+      </w:pPr>
+    </w:lvl>
+  </w:abstractNum>
+  <w:abstractNum w:abstractNumId="22" w15:restartNumberingAfterBreak="0">
     <w:nsid w:val="7A817BE2"/>
     <w:multiLevelType w:val="multilevel"/>
     <w:tmpl w:val="E48675C0"/>
@@ -1772,7 +3644,7 @@
       </w:rPr>
     </w:lvl>
   </w:abstractNum>
-  <w:abstractNum w:abstractNumId="13" w15:restartNumberingAfterBreak="0">
+  <w:abstractNum w:abstractNumId="23" w15:restartNumberingAfterBreak="0">
     <w:nsid w:val="7C272490"/>
     <w:multiLevelType w:val="multilevel"/>
     <w:tmpl w:val="B8E4B344"/>
@@ -1889,7 +3761,7 @@
       </w:pPr>
     </w:lvl>
   </w:abstractNum>
-  <w:abstractNum w:abstractNumId="14" w15:restartNumberingAfterBreak="0">
+  <w:abstractNum w:abstractNumId="24" w15:restartNumberingAfterBreak="0">
     <w:nsid w:val="7EE15649"/>
     <w:multiLevelType w:val="multilevel"/>
     <w:tmpl w:val="E66EBE44"/>
@@ -2039,49 +3911,79 @@
     </w:lvl>
   </w:abstractNum>
   <w:num w:numId="1" w16cid:durableId="1416434944">
-    <w:abstractNumId w:val="12"/>
+    <w:abstractNumId w:val="22"/>
   </w:num>
   <w:num w:numId="2" w16cid:durableId="812138750">
-    <w:abstractNumId w:val="10"/>
+    <w:abstractNumId w:val="18"/>
   </w:num>
   <w:num w:numId="3" w16cid:durableId="521551030">
-    <w:abstractNumId w:val="1"/>
+    <w:abstractNumId w:val="2"/>
   </w:num>
   <w:num w:numId="4" w16cid:durableId="1589772745">
+    <w:abstractNumId w:val="16"/>
+  </w:num>
+  <w:num w:numId="5" w16cid:durableId="926888510">
     <w:abstractNumId w:val="8"/>
   </w:num>
-  <w:num w:numId="5" w16cid:durableId="926888510">
-    <w:abstractNumId w:val="4"/>
+  <w:num w:numId="6" w16cid:durableId="1728802679">
+    <w:abstractNumId w:val="11"/>
   </w:num>
-  <w:num w:numId="6" w16cid:durableId="1728802679">
+  <w:num w:numId="7" w16cid:durableId="1998801007">
+    <w:abstractNumId w:val="24"/>
+  </w:num>
+  <w:num w:numId="8" w16cid:durableId="1400442338">
+    <w:abstractNumId w:val="23"/>
+  </w:num>
+  <w:num w:numId="9" w16cid:durableId="861822586">
+    <w:abstractNumId w:val="17"/>
+  </w:num>
+  <w:num w:numId="10" w16cid:durableId="445393517">
     <w:abstractNumId w:val="5"/>
   </w:num>
-  <w:num w:numId="7" w16cid:durableId="1998801007">
-    <w:abstractNumId w:val="14"/>
-  </w:num>
-  <w:num w:numId="8" w16cid:durableId="1400442338">
-    <w:abstractNumId w:val="13"/>
-  </w:num>
-  <w:num w:numId="9" w16cid:durableId="861822586">
-    <w:abstractNumId w:val="9"/>
-  </w:num>
-  <w:num w:numId="10" w16cid:durableId="445393517">
-    <w:abstractNumId w:val="2"/>
-  </w:num>
   <w:num w:numId="11" w16cid:durableId="716275193">
-    <w:abstractNumId w:val="6"/>
+    <w:abstractNumId w:val="12"/>
   </w:num>
   <w:num w:numId="12" w16cid:durableId="434979862">
     <w:abstractNumId w:val="0"/>
   </w:num>
   <w:num w:numId="13" w16cid:durableId="842203701">
+    <w:abstractNumId w:val="7"/>
+  </w:num>
+  <w:num w:numId="14" w16cid:durableId="802698618">
+    <w:abstractNumId w:val="19"/>
+  </w:num>
+  <w:num w:numId="15" w16cid:durableId="877427510">
+    <w:abstractNumId w:val="13"/>
+  </w:num>
+  <w:num w:numId="16" w16cid:durableId="741875636">
+    <w:abstractNumId w:val="21"/>
+  </w:num>
+  <w:num w:numId="17" w16cid:durableId="1666474265">
+    <w:abstractNumId w:val="9"/>
+  </w:num>
+  <w:num w:numId="18" w16cid:durableId="414985038">
+    <w:abstractNumId w:val="15"/>
+  </w:num>
+  <w:num w:numId="19" w16cid:durableId="781611620">
     <w:abstractNumId w:val="3"/>
   </w:num>
-  <w:num w:numId="14" w16cid:durableId="802698618">
-    <w:abstractNumId w:val="11"/>
+  <w:num w:numId="20" w16cid:durableId="456221015">
+    <w:abstractNumId w:val="6"/>
   </w:num>
-  <w:num w:numId="15" w16cid:durableId="877427510">
-    <w:abstractNumId w:val="7"/>
+  <w:num w:numId="21" w16cid:durableId="304356245">
+    <w:abstractNumId w:val="4"/>
+  </w:num>
+  <w:num w:numId="22" w16cid:durableId="1963147033">
+    <w:abstractNumId w:val="20"/>
+  </w:num>
+  <w:num w:numId="23" w16cid:durableId="1049182502">
+    <w:abstractNumId w:val="14"/>
+  </w:num>
+  <w:num w:numId="24" w16cid:durableId="255943040">
+    <w:abstractNumId w:val="1"/>
+  </w:num>
+  <w:num w:numId="25" w16cid:durableId="1843205020">
+    <w:abstractNumId w:val="10"/>
   </w:num>
 </w:numbering>
 </file>

</xml_diff>